<commit_message>
draft of tournament scraping
</commit_message>
<xml_diff>
--- a/ProgrammingProject.docx
+++ b/ProgrammingProject.docx
@@ -27,80 +27,80 @@
     </w:p>
     <w:p>
       <w:r>
+        <w:rPr/>
         <w:t xml:space="preserve">Things </w:t>
       </w:r>
-      <w:proofErr w:type="spellStart"/>
-      <w:r>
+      <w:r>
+        <w:rPr/>
         <w:t>needed</w:t>
       </w:r>
-      <w:proofErr w:type="spellEnd"/>
-      <w:r>
+      <w:r>
+        <w:rPr/>
         <w:t xml:space="preserve"> </w:t>
       </w:r>
-      <w:proofErr w:type="spellStart"/>
-      <w:r>
+      <w:r>
+        <w:rPr/>
         <w:t>to</w:t>
       </w:r>
-      <w:proofErr w:type="spellEnd"/>
-      <w:r>
+      <w:r>
+        <w:rPr/>
         <w:t xml:space="preserve"> </w:t>
       </w:r>
-      <w:proofErr w:type="spellStart"/>
-      <w:r>
+      <w:r>
+        <w:rPr/>
         <w:t>run</w:t>
       </w:r>
-      <w:proofErr w:type="spellEnd"/>
-      <w:r>
+      <w:r>
+        <w:rPr/>
         <w:t xml:space="preserve"> </w:t>
       </w:r>
-      <w:proofErr w:type="spellStart"/>
-      <w:r>
+      <w:r>
+        <w:rPr/>
         <w:t>the</w:t>
       </w:r>
-      <w:proofErr w:type="spellEnd"/>
-      <w:r>
+      <w:r>
+        <w:rPr/>
         <w:t xml:space="preserve"> code: </w:t>
       </w:r>
       <w:r>
         <w:br/>
       </w:r>
-      <w:proofErr w:type="spellStart"/>
-      <w:r>
+      <w:r>
+        <w:rPr/>
         <w:t>pip</w:t>
       </w:r>
-      <w:proofErr w:type="spellEnd"/>
-      <w:r>
+      <w:r>
+        <w:rPr/>
         <w:t xml:space="preserve"> </w:t>
       </w:r>
-      <w:proofErr w:type="spellStart"/>
-      <w:r>
+      <w:r>
+        <w:rPr/>
         <w:t>install</w:t>
       </w:r>
-      <w:proofErr w:type="spellEnd"/>
-      <w:r>
+      <w:r>
+        <w:rPr/>
         <w:t xml:space="preserve"> </w:t>
       </w:r>
-      <w:proofErr w:type="spellStart"/>
-      <w:r>
+      <w:r>
+        <w:rPr/>
         <w:t>requests</w:t>
       </w:r>
-      <w:proofErr w:type="spellEnd"/>
-      <w:r>
+      <w:r>
+        <w:rPr/>
         <w:t xml:space="preserve"> </w:t>
       </w:r>
-      <w:proofErr w:type="spellStart"/>
-      <w:r>
+      <w:r>
+        <w:rPr/>
         <w:t>lxml</w:t>
       </w:r>
-      <w:proofErr w:type="spellEnd"/>
-      <w:r>
+      <w:r>
+        <w:rPr/>
         <w:t xml:space="preserve"> </w:t>
       </w:r>
-      <w:proofErr w:type="spellStart"/>
-      <w:r>
+      <w:r>
+        <w:rPr/>
         <w:t>selenium</w:t>
       </w:r>
-      <w:proofErr w:type="spellEnd"/>
       <w:r>
         <w:br/>
       </w:r>
@@ -108,10 +108,21 @@
         <w:rPr>
           <w:lang w:val="en-GB"/>
         </w:rPr>
-        <w:t>pip install webdriver-manager</w:t>
-      </w:r>
-    </w:p>
-    <w:p/>
+        <w:t xml:space="preserve">pip install </w:t>
+      </w:r>
+      <w:r>
+        <w:rPr>
+          <w:lang w:val="en-GB"/>
+        </w:rPr>
+        <w:t>webdriver</w:t>
+      </w:r>
+      <w:r>
+        <w:rPr>
+          <w:lang w:val="en-GB"/>
+        </w:rPr>
+        <w:t>-manager</w:t>
+      </w:r>
+    </w:p>
     <w:p>
       <w:pPr>
         <w:pStyle w:val="Heading3"/>
@@ -1275,598 +1286,13 @@
         <w:rPr>
           <w:rFonts w:ascii="Aptos" w:hAnsi="Aptos" w:eastAsia="Aptos" w:cs="Aptos"/>
         </w:rPr>
-        <w:t xml:space="preserve"> topics</w:t>
-      </w:r>
-    </w:p>
-    <w:p>
-      <w:pPr>
-        <w:pStyle w:val="Normal"/>
-        <w:spacing w:before="240" w:after="240"/>
-        <w:ind w:left="0"/>
-        <w:rPr>
-          <w:rFonts w:ascii="Aptos" w:hAnsi="Aptos" w:eastAsia="Aptos" w:cs="Aptos"/>
-        </w:rPr>
-      </w:pPr>
-      <w:r>
-        <w:rPr>
-          <w:rFonts w:ascii="Aptos" w:hAnsi="Aptos" w:eastAsia="Aptos" w:cs="Aptos"/>
-        </w:rPr>
-        <w:t xml:space="preserve">Works </w:t>
-      </w:r>
-      <w:r>
-        <w:rPr>
-          <w:rFonts w:ascii="Aptos" w:hAnsi="Aptos" w:eastAsia="Aptos" w:cs="Aptos"/>
-        </w:rPr>
-        <w:t>partially:</w:t>
-      </w:r>
-      <w:r>
-        <w:br/>
-      </w:r>
-      <w:r>
-        <w:rPr>
-          <w:rFonts w:ascii="Aptos" w:hAnsi="Aptos" w:eastAsia="Aptos" w:cs="Aptos"/>
-        </w:rPr>
-        <w:t>def scrape_player_profile(name):</w:t>
-      </w:r>
-    </w:p>
-    <w:p>
-      <w:pPr>
-        <w:pStyle w:val="Normal"/>
-        <w:spacing w:before="240" w:after="240"/>
-        <w:ind w:left="0"/>
-      </w:pPr>
-      <w:r>
-        <w:rPr>
-          <w:rFonts w:ascii="Aptos" w:hAnsi="Aptos" w:eastAsia="Aptos" w:cs="Aptos"/>
-        </w:rPr>
-        <w:t xml:space="preserve">    clean = clean_name_for_url(name)</w:t>
-      </w:r>
-    </w:p>
-    <w:p>
-      <w:pPr>
-        <w:pStyle w:val="Normal"/>
-        <w:spacing w:before="240" w:after="240"/>
-        <w:ind w:left="0"/>
-      </w:pPr>
-      <w:r>
-        <w:rPr>
-          <w:rFonts w:ascii="Aptos" w:hAnsi="Aptos" w:eastAsia="Aptos" w:cs="Aptos"/>
-        </w:rPr>
-        <w:t xml:space="preserve">    url = f"https://www.tennisabstract.com/cgi-bin/player-classic.cgi?p={clean}"</w:t>
-      </w:r>
-    </w:p>
-    <w:p>
-      <w:pPr>
-        <w:pStyle w:val="Normal"/>
-        <w:spacing w:before="240" w:after="240"/>
-        <w:ind w:left="0"/>
-        <w:rPr>
-          <w:rFonts w:ascii="Aptos" w:hAnsi="Aptos" w:eastAsia="Aptos" w:cs="Aptos"/>
-        </w:rPr>
-      </w:pPr>
-    </w:p>
-    <w:p>
-      <w:pPr>
-        <w:pStyle w:val="Normal"/>
-        <w:spacing w:before="240" w:after="240"/>
-        <w:ind w:left="0"/>
-      </w:pPr>
-      <w:r>
-        <w:rPr>
-          <w:rFonts w:ascii="Aptos" w:hAnsi="Aptos" w:eastAsia="Aptos" w:cs="Aptos"/>
-        </w:rPr>
-        <w:t xml:space="preserve">    print("\n=== SCRAPING PLAYER ===")</w:t>
-      </w:r>
-    </w:p>
-    <w:p>
-      <w:pPr>
-        <w:pStyle w:val="Normal"/>
-        <w:spacing w:before="240" w:after="240"/>
-        <w:ind w:left="0"/>
-      </w:pPr>
-      <w:r>
-        <w:rPr>
-          <w:rFonts w:ascii="Aptos" w:hAnsi="Aptos" w:eastAsia="Aptos" w:cs="Aptos"/>
-        </w:rPr>
-        <w:t xml:space="preserve">    print("URL:", url)</w:t>
-      </w:r>
-    </w:p>
-    <w:p>
-      <w:pPr>
-        <w:pStyle w:val="Normal"/>
-        <w:spacing w:before="240" w:after="240"/>
-        <w:ind w:left="0"/>
-        <w:rPr>
-          <w:rFonts w:ascii="Aptos" w:hAnsi="Aptos" w:eastAsia="Aptos" w:cs="Aptos"/>
-        </w:rPr>
-      </w:pPr>
-    </w:p>
-    <w:p>
-      <w:pPr>
-        <w:pStyle w:val="Normal"/>
-        <w:spacing w:before="240" w:after="240"/>
-        <w:ind w:left="0"/>
-      </w:pPr>
-      <w:r>
-        <w:rPr>
-          <w:rFonts w:ascii="Aptos" w:hAnsi="Aptos" w:eastAsia="Aptos" w:cs="Aptos"/>
-        </w:rPr>
-        <w:t xml:space="preserve">    # Load page with Selenium (JS executes here)</w:t>
-      </w:r>
-    </w:p>
-    <w:p>
-      <w:pPr>
-        <w:pStyle w:val="Normal"/>
-        <w:spacing w:before="240" w:after="240"/>
-        <w:ind w:left="0"/>
-      </w:pPr>
-      <w:r>
-        <w:rPr>
-          <w:rFonts w:ascii="Aptos" w:hAnsi="Aptos" w:eastAsia="Aptos" w:cs="Aptos"/>
-        </w:rPr>
-        <w:t xml:space="preserve">    driver.get(url)</w:t>
-      </w:r>
-    </w:p>
-    <w:p>
-      <w:pPr>
-        <w:pStyle w:val="Normal"/>
-        <w:spacing w:before="240" w:after="240"/>
-        <w:ind w:left="0"/>
-      </w:pPr>
-      <w:r>
-        <w:rPr>
-          <w:rFonts w:ascii="Aptos" w:hAnsi="Aptos" w:eastAsia="Aptos" w:cs="Aptos"/>
-        </w:rPr>
-        <w:t xml:space="preserve">    time.sleep(1)  # Let JavaScript populate the BIO section</w:t>
-      </w:r>
-    </w:p>
-    <w:p>
-      <w:pPr>
-        <w:pStyle w:val="Normal"/>
-        <w:spacing w:before="240" w:after="240"/>
-        <w:ind w:left="0"/>
-        <w:rPr>
-          <w:rFonts w:ascii="Aptos" w:hAnsi="Aptos" w:eastAsia="Aptos" w:cs="Aptos"/>
-        </w:rPr>
-      </w:pPr>
-    </w:p>
-    <w:p>
-      <w:pPr>
-        <w:pStyle w:val="Normal"/>
-        <w:spacing w:before="240" w:after="240"/>
-        <w:ind w:left="0"/>
-      </w:pPr>
-      <w:r>
-        <w:rPr>
-          <w:rFonts w:ascii="Aptos" w:hAnsi="Aptos" w:eastAsia="Aptos" w:cs="Aptos"/>
-        </w:rPr>
-        <w:t xml:space="preserve">    # Find bio rows inside the nested table</w:t>
-      </w:r>
-    </w:p>
-    <w:p>
-      <w:pPr>
-        <w:pStyle w:val="Normal"/>
-        <w:spacing w:before="240" w:after="240"/>
-        <w:ind w:left="0"/>
-      </w:pPr>
-      <w:r>
-        <w:rPr>
-          <w:rFonts w:ascii="Aptos" w:hAnsi="Aptos" w:eastAsia="Aptos" w:cs="Aptos"/>
-        </w:rPr>
-        <w:t xml:space="preserve">    rows = driver.find_elements(By.XPATH, '//p[@id="biog"]//table//tr')</w:t>
-      </w:r>
-    </w:p>
-    <w:p>
-      <w:pPr>
-        <w:pStyle w:val="Normal"/>
-        <w:spacing w:before="240" w:after="240"/>
-        <w:ind w:left="0"/>
-      </w:pPr>
-      <w:r>
-        <w:rPr>
-          <w:rFonts w:ascii="Aptos" w:hAnsi="Aptos" w:eastAsia="Aptos" w:cs="Aptos"/>
-        </w:rPr>
-        <w:t xml:space="preserve">    print("Found bio rows:", len(rows))</w:t>
-      </w:r>
-    </w:p>
-    <w:p>
-      <w:pPr>
-        <w:pStyle w:val="Normal"/>
-        <w:spacing w:before="240" w:after="240"/>
-        <w:ind w:left="0"/>
-        <w:rPr>
-          <w:rFonts w:ascii="Aptos" w:hAnsi="Aptos" w:eastAsia="Aptos" w:cs="Aptos"/>
-        </w:rPr>
-      </w:pPr>
-    </w:p>
-    <w:p>
-      <w:pPr>
-        <w:pStyle w:val="Normal"/>
-        <w:spacing w:before="240" w:after="240"/>
-        <w:ind w:left="0"/>
-      </w:pPr>
-      <w:r>
-        <w:rPr>
-          <w:rFonts w:ascii="Aptos" w:hAnsi="Aptos" w:eastAsia="Aptos" w:cs="Aptos"/>
-        </w:rPr>
-        <w:t xml:space="preserve">    info = {"name": name}</w:t>
-      </w:r>
-    </w:p>
-    <w:p>
-      <w:pPr>
-        <w:pStyle w:val="Normal"/>
-        <w:spacing w:before="240" w:after="240"/>
-        <w:ind w:left="0"/>
-        <w:rPr>
-          <w:rFonts w:ascii="Aptos" w:hAnsi="Aptos" w:eastAsia="Aptos" w:cs="Aptos"/>
-        </w:rPr>
-      </w:pPr>
-    </w:p>
-    <w:p>
-      <w:pPr>
-        <w:pStyle w:val="Normal"/>
-        <w:spacing w:before="240" w:after="240"/>
-        <w:ind w:left="0"/>
-      </w:pPr>
-      <w:r>
-        <w:rPr>
-          <w:rFonts w:ascii="Aptos" w:hAnsi="Aptos" w:eastAsia="Aptos" w:cs="Aptos"/>
-        </w:rPr>
-        <w:t xml:space="preserve">    for r in rows:</w:t>
-      </w:r>
-    </w:p>
-    <w:p>
-      <w:pPr>
-        <w:pStyle w:val="Normal"/>
-        <w:spacing w:before="240" w:after="240"/>
-        <w:ind w:left="0"/>
-      </w:pPr>
-      <w:r>
-        <w:rPr>
-          <w:rFonts w:ascii="Aptos" w:hAnsi="Aptos" w:eastAsia="Aptos" w:cs="Aptos"/>
-        </w:rPr>
-        <w:t xml:space="preserve">        text = r.text.strip()</w:t>
-      </w:r>
-    </w:p>
-    <w:p>
-      <w:pPr>
-        <w:pStyle w:val="Normal"/>
-        <w:spacing w:before="240" w:after="240"/>
-        <w:ind w:left="0"/>
-      </w:pPr>
-      <w:r>
-        <w:rPr>
-          <w:rFonts w:ascii="Aptos" w:hAnsi="Aptos" w:eastAsia="Aptos" w:cs="Aptos"/>
-        </w:rPr>
-        <w:t xml:space="preserve">        if ":" in text:</w:t>
-      </w:r>
-    </w:p>
-    <w:p>
-      <w:pPr>
-        <w:pStyle w:val="Normal"/>
-        <w:spacing w:before="240" w:after="240"/>
-        <w:ind w:left="0"/>
-      </w:pPr>
-      <w:r>
-        <w:rPr>
-          <w:rFonts w:ascii="Aptos" w:hAnsi="Aptos" w:eastAsia="Aptos" w:cs="Aptos"/>
-        </w:rPr>
-        <w:t xml:space="preserve">            key, val = text.split(":", 1)</w:t>
-      </w:r>
-    </w:p>
-    <w:p>
-      <w:pPr>
-        <w:pStyle w:val="Normal"/>
-        <w:spacing w:before="240" w:after="240"/>
-        <w:ind w:left="0"/>
-      </w:pPr>
-      <w:r>
-        <w:rPr>
-          <w:rFonts w:ascii="Aptos" w:hAnsi="Aptos" w:eastAsia="Aptos" w:cs="Aptos"/>
-        </w:rPr>
-        <w:t xml:space="preserve">            key = key.strip().lower()</w:t>
-      </w:r>
-    </w:p>
-    <w:p>
-      <w:pPr>
-        <w:pStyle w:val="Normal"/>
-        <w:spacing w:before="240" w:after="240"/>
-        <w:ind w:left="0"/>
-      </w:pPr>
-      <w:r>
-        <w:rPr>
-          <w:rFonts w:ascii="Aptos" w:hAnsi="Aptos" w:eastAsia="Aptos" w:cs="Aptos"/>
-        </w:rPr>
-        <w:t xml:space="preserve">            info[key] = val.strip()</w:t>
-      </w:r>
-    </w:p>
-    <w:p>
-      <w:pPr>
-        <w:pStyle w:val="Normal"/>
-        <w:spacing w:before="240" w:after="240"/>
-        <w:ind w:left="0"/>
-      </w:pPr>
-      <w:r>
-        <w:rPr>
-          <w:rFonts w:ascii="Aptos" w:hAnsi="Aptos" w:eastAsia="Aptos" w:cs="Aptos"/>
-        </w:rPr>
-        <w:t xml:space="preserve">            print("Extracted:", key, "=", val.strip())</w:t>
-      </w:r>
-    </w:p>
-    <w:p>
-      <w:pPr>
-        <w:pStyle w:val="Normal"/>
-        <w:spacing w:before="240" w:after="240"/>
-        <w:ind w:left="0"/>
-        <w:rPr>
-          <w:rFonts w:ascii="Aptos" w:hAnsi="Aptos" w:eastAsia="Aptos" w:cs="Aptos"/>
-        </w:rPr>
-      </w:pPr>
-    </w:p>
-    <w:p>
-      <w:pPr>
-        <w:pStyle w:val="Normal"/>
-        <w:spacing w:before="240" w:after="240"/>
-        <w:ind w:left="0"/>
-      </w:pPr>
-      <w:r>
-        <w:rPr>
-          <w:rFonts w:ascii="Aptos" w:hAnsi="Aptos" w:eastAsia="Aptos" w:cs="Aptos"/>
-        </w:rPr>
-        <w:t xml:space="preserve">    return info</w:t>
-      </w:r>
-    </w:p>
-    <w:p>
-      <w:pPr>
-        <w:pStyle w:val="Normal"/>
-        <w:spacing w:before="240" w:after="240"/>
-        <w:ind w:left="0"/>
-        <w:rPr>
-          <w:rFonts w:ascii="Aptos" w:hAnsi="Aptos" w:eastAsia="Aptos" w:cs="Aptos"/>
-        </w:rPr>
-      </w:pPr>
-    </w:p>
-    <w:p>
-      <w:pPr>
-        <w:pStyle w:val="Normal"/>
-      </w:pPr>
-      <w:r>
-        <w:rPr/>
-        <w:t>&lt;table width="1240px"&gt;</w:t>
-      </w:r>
-    </w:p>
-    <w:p>
-      <w:pPr>
-        <w:pStyle w:val="Normal"/>
-      </w:pPr>
-      <w:r>
-        <w:rPr/>
-        <w:t>&lt;tbody&gt;&lt;tr&gt;&lt;td&gt;&amp;nbsp;&lt;/td&gt;&lt;td&gt;&amp;nbsp;&lt;/td&gt;</w:t>
-      </w:r>
-    </w:p>
-    <w:p>
-      <w:pPr>
-        <w:pStyle w:val="Normal"/>
-      </w:pPr>
-      <w:r>
-        <w:rPr/>
-        <w:t>&lt;/tr&gt;</w:t>
-      </w:r>
-    </w:p>
-    <w:p>
-      <w:pPr>
-        <w:pStyle w:val="Normal"/>
-      </w:pPr>
-      <w:r>
-        <w:rPr/>
         <w:t xml:space="preserve"> </w:t>
       </w:r>
-    </w:p>
-    <w:p>
-      <w:pPr>
-        <w:pStyle w:val="Normal"/>
-      </w:pPr>
-      <w:r>
-        <w:rPr/>
-        <w:t>&lt;tr&gt;</w:t>
-      </w:r>
-    </w:p>
-    <w:p>
-      <w:pPr>
-        <w:pStyle w:val="Normal"/>
-      </w:pPr>
-      <w:r>
-        <w:rPr/>
-        <w:t>&lt;td align="left" style="vertical-align:top"&gt;&lt;span id="bio"&gt;&lt;p id="biog"&gt;&lt;table style="border-spacing:0"&gt;&lt;tbody&gt;&lt;tr&gt;&lt;td&gt;&lt;img src="https://www.tennisabstract.com/photos/carlos_alcaraz-350z33.jpg" height="225" width="150"&gt;&lt;/td&gt;&lt;td&gt;&amp;nbsp;&amp;nbsp;&lt;/td&gt;&lt;td style="vertical-align:top"&gt;&lt;table cellpadding="2" cellspacing="1"&gt;&lt;tbody&gt;&lt;tr&gt;&lt;td&gt;&lt;span style="fontsize:24px"&gt;&lt;b&gt;Carlos Alcaraz [ESP]&lt;/b&gt;&lt;/span&gt;&amp;nbsp;&amp;nbsp;&amp;nbsp;&amp;nbsp;&amp;nbsp;&amp;nbsp;&amp;nbsp;&amp;nbsp;&lt;/td&gt;&lt;/tr&gt;&lt;tr&gt;&lt;td&gt;&lt;a href="https://twitter.com/carlosalcaraz" target="_blank"&gt;@carlosalcaraz&lt;/a&gt;&lt;/td&gt;&lt;/tr&gt;&lt;tr&gt;&lt;td&gt;Age: 22 (05-May-2003)&lt;/td&gt;&lt;/tr&gt;&lt;tr&gt;&lt;td&gt;Plays: Right (two-handed backhand)&lt;/td&gt;&lt;/tr&gt;&lt;tr&gt;&lt;td&gt;Current rank: &lt;b&gt;1&lt;/b&gt;&lt;/td&gt;&lt;/tr&gt;&lt;tr&gt;&lt;td&gt;Peak rank: &lt;b&gt;1&lt;/b&gt; (12-Sep-2022)&lt;/td&gt;&lt;/tr&gt;&lt;tr&gt;&lt;td&gt;Elo rank: &lt;b&gt;2&lt;/b&gt; (&lt;a href="https://tennisabstract.com/reports/atp_elo_ratings.html"&gt;rating: 2272)&lt;/a&gt;&lt;/td&gt;&lt;/tr&gt;&lt;tr&gt;&lt;td&gt;Profile: &lt;a href="https://en.wikipedia.org/wiki/Carlos_Alcaraz" target="_blank" title="Profile at Wikipedia"&gt;Wikipedia&lt;/a&gt;&lt;/td&gt;&lt;td&gt;&amp;nbsp;&lt;/td&gt;&lt;/tr&gt;&lt;tr&gt;&lt;td&gt;&lt;span id="titleclick" class="likelink"&gt;Titles/Finals&lt;/span&gt;&lt;/td&gt;&lt;/tr&gt;&lt;tr&gt;&lt;td&gt;&lt;i&gt;Photo: &lt;a target="_blank" href="https://en.wikipedia.org/wiki/User:350z33"&gt;350z33&lt;/a&gt;&lt;/i&gt;&lt;/td&gt;&lt;/tr&gt;&lt;/tbody&gt;&lt;/table&gt;&lt;/td&gt;&lt;td&gt;&amp;nbsp;&amp;nbsp;&lt;/td&gt;&lt;/tr&gt;&lt;/tbody&gt;&lt;/table&gt;&lt;/p&gt;&lt;/span&gt;</w:t>
-      </w:r>
-    </w:p>
-    <w:p>
-      <w:pPr>
-        <w:pStyle w:val="Normal"/>
-      </w:pPr>
-      <w:r>
-        <w:rPr/>
-        <w:t xml:space="preserve"> </w:t>
-      </w:r>
-    </w:p>
-    <w:p>
-      <w:pPr>
-        <w:pStyle w:val="Normal"/>
-      </w:pPr>
-      <w:r>
-        <w:rPr/>
-        <w:t>&lt;span id="tabResults" style="background-color:#e6EEEE;" class="tabview"&gt;&amp;nbsp;&lt;b&gt;Singles Results&lt;/b&gt;&amp;nbsp;&lt;/span&gt;&amp;nbsp;</w:t>
-      </w:r>
-    </w:p>
-    <w:p>
-      <w:pPr>
-        <w:pStyle w:val="Normal"/>
-      </w:pPr>
-      <w:r>
-        <w:rPr/>
-        <w:t>&lt;span id="tabHead" style="background-color:#e6EEEE;" class="tablink tabview"&gt;&amp;nbsp;&lt;b&gt;Head-to-Heads&lt;/b&gt;&amp;nbsp;&lt;/span&gt;&amp;nbsp;</w:t>
-      </w:r>
-    </w:p>
-    <w:p>
-      <w:pPr>
-        <w:pStyle w:val="Normal"/>
-      </w:pPr>
-      <w:r>
-        <w:rPr/>
-        <w:t>&lt;span id="tabEvents" style="background-color:#e6EEEE;" class="tablink tabview"&gt;&amp;nbsp;&lt;b&gt;Event Records&lt;/b&gt;&amp;nbsp;&lt;/span&gt;</w:t>
-      </w:r>
-    </w:p>
-    <w:p>
-      <w:pPr>
-        <w:pStyle w:val="Normal"/>
-      </w:pPr>
-      <w:r>
-        <w:rPr/>
-        <w:t>&lt;br&gt;&lt;span id="tabDubs" style="background-color: rgb(230, 238, 238); position: relative; top: 5px; display: none;" class="tablink tabview"&gt;&amp;nbsp;&lt;b&gt;Doubles Results&lt;/b&gt;&amp;nbsp;&lt;/span&gt;&lt;span id="tabDubsSpacer" style="display: none;"&gt;&amp;nbsp;&amp;nbsp;&lt;/span&gt;</w:t>
-      </w:r>
-    </w:p>
-    <w:p>
-      <w:pPr>
-        <w:pStyle w:val="Normal"/>
-      </w:pPr>
-      <w:r>
-        <w:rPr/>
-        <w:t>&lt;span id="shotsHere"&gt;</w:t>
-      </w:r>
-    </w:p>
-    <w:p>
-      <w:pPr>
-        <w:pStyle w:val="Normal"/>
-      </w:pPr>
-      <w:r>
-        <w:rPr/>
-        <w:t>&lt;/span&gt;</w:t>
-      </w:r>
-    </w:p>
-    <w:p>
-      <w:pPr>
-        <w:pStyle w:val="Normal"/>
-      </w:pPr>
-      <w:r>
-        <w:rPr/>
-        <w:t>&lt;/td&gt;</w:t>
-      </w:r>
-    </w:p>
-    <w:p>
-      <w:pPr>
-        <w:pStyle w:val="Normal"/>
-      </w:pPr>
-      <w:r>
-        <w:rPr/>
-        <w:t>&lt;td id="wonloss" align="right" style="vertical-align:top"&gt;&lt;table class="tablesorter" id="overall" width="40%" border="0" cellspacing="0" cellpadding="0" style="padding-top: 0px; border-top: 0px;"&gt;&lt;thead&gt;&lt;tr&gt;&lt;th&gt;&lt;span&gt;TOTALS&lt;/span&gt;&lt;/th&gt;&lt;th&gt;&lt;span&gt;Match&lt;/span&gt;&lt;/th&gt;&lt;th&gt;&lt;span&gt;Tiebreak&lt;/span&gt;&lt;/th&gt;&lt;th&gt;&lt;span title="Ace rate"&gt;Ace%&lt;/span&gt;&lt;/th&gt;&lt;th&gt;&lt;span&gt;1stIn&lt;/span&gt;&lt;/th&gt;&lt;th&gt;&lt;span title="First serve points won"&gt;1st%&lt;/span&gt;&lt;/th&gt;&lt;th&gt;&lt;span title="Second serve points won"&gt;2nd%&lt;/span&gt;&lt;/th&gt;&lt;th&gt;&lt;span&gt;Hld%&lt;/span&gt;&lt;/th&gt;&lt;th&gt;&lt;span title="Service points won"&gt;SPW&lt;/span&gt;&lt;/th&gt;&lt;th&gt;&lt;span&gt;Brk%&lt;/span&gt;&lt;/th&gt;&lt;th&gt;&lt;span title="Return points won"&gt;RPW&lt;/span&gt;&lt;/th&gt;&lt;th&gt;&lt;span title="Total points won"&gt;TPW&lt;/span&gt;&lt;/th&gt;&lt;th&gt;&lt;span title="Dominance Ratio: % of return points won</w:t>
-      </w:r>
-    </w:p>
-    <w:p>
-      <w:pPr>
-        <w:pStyle w:val="Normal"/>
-      </w:pPr>
-      <w:r>
-        <w:rPr/>
-        <w:t>divided by % of serve points lost."&gt;DR&lt;/span&gt;&lt;/th&gt;&lt;/tr&gt;&lt;/thead&gt;&lt;tbody id="splitsbody"&gt;&lt;tr id="s"&gt;&lt;td&gt;&lt;span&gt;Last 52 &lt;/span&gt;&lt;/td&gt;&lt;td align="right"&gt;73-7 (91%)&lt;/td&gt;&lt;td align="right"&gt;21-13 (62%)&lt;/td&gt;&lt;td align="right"&gt;7.1%&lt;/td&gt;&lt;td align="right"&gt;65.3%&lt;/td&gt;&lt;td align="right"&gt;74.3%&lt;/td&gt;&lt;td align="right"&gt;57.1%&lt;/td&gt;&lt;td align="right"&gt;88.7%&lt;/td&gt;&lt;td align="right"&gt;68.3%&lt;/td&gt;&lt;td align="right"&gt;30.6%&lt;/td&gt;&lt;td align="right"&gt;41.6%&lt;/td&gt;&lt;td align="right"&gt;54.5%&lt;/td&gt;&lt;td align="right"&gt;1.31&lt;/td&gt;&lt;/tr&gt;&lt;tr class="moresplits" id="sB0" style="display: table-row;"&gt;&lt;td&gt;&lt;span&gt;&amp;nbsp;&amp;nbsp;Hard &lt;/span&gt;&lt;/td&gt;&lt;td align="right"&gt;40-5 (89%)&lt;/td&gt;&lt;td align="right"&gt;10-7 (59%)&lt;/td&gt;&lt;td align="right"&gt;7.7%&lt;/td&gt;&lt;td align="right"&gt;66.1%&lt;/td&gt;&lt;td align="right"&gt;75.9%&lt;/td&gt;&lt;td align="right"&gt;57.6%&lt;/td&gt;&lt;td align="right"&gt;90.6%&lt;/td&gt;&lt;td align="right"&gt;69.7%&lt;/td&gt;&lt;td align="right"&gt;30.0%&lt;/td&gt;&lt;td align="right"&gt;41.2%&lt;/td&gt;&lt;td align="right"&gt;54.7%&lt;/td&gt;&lt;td align="right"&gt;1.36&lt;/td&gt;&lt;/tr&gt;&lt;tr class="moresplits" id="sB1" style="display: table-row;"&gt;&lt;td&gt;&lt;span&gt;&amp;nbsp;&amp;nbsp;Clay &lt;/span&gt;&lt;/td&gt;&lt;td align="right"&gt;22-1 (96%)&lt;/td&gt;&lt;td align="right"&gt;9-2 (82%)&lt;/td&gt;&lt;td align="right"&gt;2.8%&lt;/td&gt;&lt;td align="right"&gt;66.3%&lt;/td&gt;&lt;td align="right"&gt;68.8%&lt;/td&gt;&lt;td align="right"&gt;56.9%&lt;/td&gt;&lt;td align="right"&gt;83.3%&lt;/td&gt;&lt;td align="right"&gt;64.8%&lt;/td&gt;&lt;td align="right"&gt;37.0%&lt;/td&gt;&lt;td align="right"&gt;44.9%&lt;/td&gt;&lt;td align="right"&gt;54.6%&lt;/td&gt;&lt;td align="right"&gt;1.27&lt;/td&gt;&lt;/tr&gt;&lt;tr class="moresplits" id="sB2" style="display: table-row;"&gt;&lt;td&gt;&lt;span&gt;&amp;nbsp;&amp;nbsp;Grass &lt;/span&gt;&lt;/td&gt;&lt;td align="right"&gt;11-1 (92%)&lt;/td&gt;&lt;td align="right"&gt;2-4 (33%)&lt;/td&gt;&lt;td align="right"&gt;12.4%&lt;/td&gt;&lt;td align="right"&gt;61.6%&lt;/td&gt;&lt;td align="right"&gt;78.9%&lt;/td&gt;&lt;td align="right"&gt;56.5%&lt;/td&gt;&lt;td align="right"&gt;91.4%&lt;/td&gt;&lt;td align="right"&gt;70.3%&lt;/td&gt;&lt;td align="right"&gt;22.6%&lt;/td&gt;&lt;td align="right"&gt;37.5%&lt;/td&gt;&lt;td align="right"&gt;53.6%&lt;/td&gt;&lt;td align="right"&gt;1.26&lt;/td&gt;&lt;/tr&gt;&lt;tr class="moresplits" id="sC0" style="display: table-row;"&gt;&lt;td&gt;&lt;span&gt;&amp;nbsp;&amp;nbsp;Grand Slams &lt;/span&gt;&lt;/td&gt;&lt;td align="right"&gt;27-1 (96%)&lt;/td&gt;&lt;td align="right"&gt;11-5 (69%)&lt;/td&gt;&lt;td align="right"&gt;7.5%&lt;/td&gt;&lt;td align="right"&gt;64.2%&lt;/td&gt;&lt;td align="right"&gt;75.7%&lt;/td&gt;&lt;td align="right"&gt;59.3%&lt;/td&gt;&lt;td align="right"&gt;90.4%&lt;/td&gt;&lt;td align="right"&gt;69.8%&lt;/td&gt;&lt;td align="right"&gt;29.9%&lt;/td&gt;&lt;td align="right"&gt;41.1%&lt;/td&gt;&lt;td align="right"&gt;54.9%&lt;/td&gt;&lt;td align="right"&gt;1.36&lt;/td&gt;&lt;/tr&gt;&lt;tr class="moresplits" id="sI0" style="display: table-row;"&gt;&lt;td&gt;&lt;span&gt;&amp;nbsp;&amp;nbsp;vs Top 10 &lt;/span&gt;&lt;/td&gt;&lt;td align="right"&gt;19-3 (86%)&lt;/td&gt;&lt;td align="right"&gt;9-5 (64%)&lt;/td&gt;&lt;td align="right"&gt;6.9%&lt;/td&gt;&lt;td align="right"&gt;62.4%&lt;/td&gt;&lt;td align="right"&gt;74.1%&lt;/td&gt;&lt;td align="right"&gt;55.6%&lt;/td&gt;&lt;td align="right"&gt;86.9%&lt;/td&gt;&lt;td align="right"&gt;67.1%&lt;/td&gt;&lt;td align="right"&gt;27.0%&lt;/td&gt;&lt;td align="right"&gt;39.7%&lt;/td&gt;&lt;td align="right"&gt;53.1%&lt;/td&gt;&lt;td align="right"&gt;1.21&lt;/td&gt;&lt;/tr&gt;&lt;tr class="moresplits" id="sK0" style="display: table-row;"&gt;&lt;td&gt;&lt;span&gt;&amp;nbsp;&amp;nbsp;vs Righties &lt;/span&gt;&lt;/td&gt;&lt;td align="right"&gt;65-6 (92%)&lt;/td&gt;&lt;td align="right"&gt;20-13 (61%)&lt;/td&gt;&lt;td align="right"&gt;7.3%&lt;/td&gt;&lt;td align="right"&gt;65.1%&lt;/td&gt;&lt;td align="right"&gt;74.5%&lt;/td&gt;&lt;td align="right"&gt;57.2%&lt;/td&gt;&lt;td align="right"&gt;88.5%&lt;/td&gt;&lt;td align="right"&gt;68.5%&lt;/td&gt;&lt;td align="right"&gt;29.8%&lt;/td&gt;&lt;td align="right"&gt;41.3%&lt;/td&gt;&lt;td align="right"&gt;54.3%&lt;/td&gt;&lt;td align="right"&gt;1.31&lt;/td&gt;&lt;/tr&gt;&lt;tr class="moresplits" id="sK1" style="display: table-row;"&gt;&lt;td&gt;&lt;span&gt;&amp;nbsp;&amp;nbsp;vs Lefties &lt;/span&gt;&lt;/td&gt;&lt;td align="right"&gt;7-1 (88%)&lt;/td&gt;&lt;td align="right"&gt;1-0 (100%)&lt;/td&gt;&lt;td align="right"&gt;6.3%&lt;/td&gt;&lt;td align="right"&gt;67.1%&lt;/td&gt;&lt;td align="right"&gt;72.7%&lt;/td&gt;&lt;td align="right"&gt;57.1%&lt;/td&gt;&lt;td align="right"&gt;90.6%&lt;/td&gt;&lt;td align="right"&gt;67.6%&lt;/td&gt;&lt;td align="right"&gt;35.0%&lt;/td&gt;&lt;td align="right"&gt;43.4%&lt;/td&gt;&lt;td align="right"&gt;55.3%&lt;/td&gt;&lt;td align="right"&gt;1.34&lt;/td&gt;&lt;/tr&gt;&lt;tr class="moresplits" id="sF2" style="display: table-row;"&gt;&lt;td&gt;&lt;span&gt;&amp;nbsp;&amp;nbsp;Best of 3 &lt;/span&gt;&lt;/td&gt;&lt;td align="right"&gt;46-6 (88%)&lt;/td&gt;&lt;td align="right"&gt;10-8 (56%)&lt;/td&gt;&lt;td align="right"&gt;6.8%&lt;/td&gt;&lt;td align="right"&gt;66.2%&lt;/td&gt;&lt;td align="right"&gt;73.1%&lt;/td&gt;&lt;td align="right"&gt;55.3%&lt;/td&gt;&lt;td align="right"&gt;87.2%&lt;/td&gt;&lt;td align="right"&gt;67.1%&lt;/td&gt;&lt;td align="right"&gt;31.1%&lt;/td&gt;&lt;td align="right"&gt;42.1%&lt;/td&gt;&lt;td align="right"&gt;54.1%&lt;/td&gt;&lt;td align="right"&gt;1.28&lt;/td&gt;&lt;/tr&gt;&lt;tr class="moresplits" id="sF3" style="display: table-row;"&gt;&lt;td&gt;&lt;span&gt;&amp;nbsp;&amp;nbsp;Best of 5 &lt;/span&gt;&lt;/td&gt;&lt;td align="right"&gt;27-1 (96%)&lt;/td&gt;&lt;td align="right"&gt;11-5 (69%)&lt;/td&gt;&lt;td align="right"&gt;7.5%&lt;/td&gt;&lt;td align="right"&gt;64.2%&lt;/td&gt;&lt;td align="right"&gt;75.7%&lt;/td&gt;&lt;td align="right"&gt;59.3%&lt;/td&gt;&lt;td align="right"&gt;90.4%&lt;/td&gt;&lt;td align="right"&gt;69.8%&lt;/td&gt;&lt;td align="right"&gt;29.9%&lt;/td&gt;&lt;td align="right"&gt;41.1%&lt;/td&gt;&lt;td align="right"&gt;54.9%&lt;/td&gt;&lt;td align="right"&gt;1.36&lt;/td&gt;&lt;/tr&gt;&lt;tr&gt;&lt;td class="yeartoggle"&gt;&lt;span class="likelink"&gt;show yearly totals&lt;/span&gt;&lt;/td&gt;&lt;td class="splittoggle"&gt;&lt;span class="likelink"&gt;hide splits&lt;/span&gt;&lt;/td&gt;&lt;td&gt;&lt;/td&gt;&lt;td&gt;&lt;/td&gt;&lt;td&gt;&lt;/td&gt;&lt;td&gt;&lt;/td&gt;&lt;td&gt;&lt;/td&gt;&lt;td&gt;&lt;/td&gt;&lt;td&gt;&lt;/td&gt;&lt;td&gt;&lt;/td&gt;&lt;td&gt;&lt;/td&gt;&lt;td&gt;&lt;/td&gt;&lt;td&gt;&lt;/td&gt;&lt;/tr&gt;&lt;/tbody&gt;&lt;/table&gt;&lt;/td&gt;</w:t>
-      </w:r>
-    </w:p>
-    <w:p>
-      <w:pPr>
-        <w:pStyle w:val="Normal"/>
-      </w:pPr>
-      <w:r>
-        <w:rPr/>
-        <w:t>&lt;/tr&gt;</w:t>
-      </w:r>
-    </w:p>
-    <w:p>
-      <w:pPr>
-        <w:pStyle w:val="Normal"/>
-      </w:pPr>
-      <w:r>
-        <w:rPr/>
-        <w:t>&lt;tr&gt;</w:t>
-      </w:r>
-    </w:p>
-    <w:p>
-      <w:pPr>
-        <w:pStyle w:val="Normal"/>
-      </w:pPr>
-      <w:r>
-        <w:rPr/>
-        <w:t>&lt;td id="tabmenu" align="left" style="vertical-align:top"&gt;</w:t>
-      </w:r>
-    </w:p>
-    <w:p>
-      <w:pPr>
-        <w:pStyle w:val="Normal"/>
-      </w:pPr>
-      <w:r>
-        <w:rPr/>
-        <w:t>&amp;nbsp;</w:t>
-      </w:r>
-    </w:p>
-    <w:p>
-      <w:pPr>
-        <w:pStyle w:val="Normal"/>
-      </w:pPr>
-      <w:r>
-        <w:rPr/>
-        <w:t>&lt;/td&gt;</w:t>
-      </w:r>
-    </w:p>
-    <w:p>
-      <w:pPr>
-        <w:pStyle w:val="Normal"/>
-      </w:pPr>
-      <w:r>
-        <w:rPr/>
-        <w:t>&lt;td&gt;&amp;nbsp;&lt;/td&gt;</w:t>
-      </w:r>
-    </w:p>
-    <w:p>
-      <w:pPr>
-        <w:pStyle w:val="Normal"/>
-      </w:pPr>
-      <w:r>
-        <w:rPr/>
-        <w:t>&lt;/tr&gt;</w:t>
-      </w:r>
-    </w:p>
-    <w:p>
-      <w:pPr>
-        <w:pStyle w:val="Normal"/>
-      </w:pPr>
-      <w:r>
-        <w:rPr/>
-        <w:t>&lt;tr&gt;</w:t>
-      </w:r>
-    </w:p>
-    <w:p>
-      <w:pPr>
-        <w:pStyle w:val="Normal"/>
-      </w:pPr>
-      <w:r>
-        <w:rPr/>
-        <w:t>&lt;td colspan="2" id="playernews"&gt;&amp;nbsp;&lt;/td&gt;</w:t>
-      </w:r>
-    </w:p>
-    <w:p>
-      <w:pPr>
-        <w:pStyle w:val="Normal"/>
-      </w:pPr>
-      <w:r>
-        <w:rPr/>
-        <w:t>&lt;/tr&gt;</w:t>
-      </w:r>
-    </w:p>
-    <w:p>
-      <w:pPr>
-        <w:pStyle w:val="Normal"/>
-      </w:pPr>
-      <w:r>
-        <w:rPr/>
-        <w:t>&lt;/tbody&gt;&lt;/table&gt;</w:t>
+      <w:r>
+        <w:rPr>
+          <w:rFonts w:ascii="Aptos" w:hAnsi="Aptos" w:eastAsia="Aptos" w:cs="Aptos"/>
+        </w:rPr>
+        <w:t>topics</w:t>
       </w:r>
     </w:p>
     <w:sectPr>

</xml_diff>